<commit_message>
fix(report-creation): fix the "Authors" typo in the report template
</commit_message>
<xml_diff>
--- a/src/assets/docx-templates/report_template.docx
+++ b/src/assets/docx-templates/report_template.docx
@@ -39,7 +39,15 @@
       </w:pPr>
       <w:r>
         <w:rPr/>
-        <w:t>Authos</w:t>
+        <w:t>Autho</w:t>
+      </w:r>
+      <w:r>
+        <w:rPr/>
+        <w:t>r</w:t>
+      </w:r>
+      <w:r>
+        <w:rPr/>
+        <w:t>s</w:t>
       </w:r>
     </w:p>
     <w:p>
@@ -413,7 +421,7 @@
         <w:pStyle w:val="Normal"/>
         <w:numPr>
           <w:ilvl w:val="0"/>
-          <w:numId w:val="3"/>
+          <w:numId w:val="2"/>
         </w:numPr>
         <w:rPr/>
       </w:pPr>
@@ -483,7 +491,7 @@
         <w:pStyle w:val="BodyText"/>
         <w:numPr>
           <w:ilvl w:val="0"/>
-          <w:numId w:val="3"/>
+          <w:numId w:val="2"/>
         </w:numPr>
         <w:rPr/>
       </w:pPr>
@@ -497,7 +505,7 @@
         <w:pStyle w:val="BodyText"/>
         <w:numPr>
           <w:ilvl w:val="0"/>
-          <w:numId w:val="3"/>
+          <w:numId w:val="2"/>
         </w:numPr>
         <w:rPr/>
       </w:pPr>
@@ -511,7 +519,7 @@
         <w:pStyle w:val="BodyText"/>
         <w:numPr>
           <w:ilvl w:val="0"/>
-          <w:numId w:val="3"/>
+          <w:numId w:val="2"/>
         </w:numPr>
         <w:rPr/>
       </w:pPr>
@@ -525,7 +533,7 @@
         <w:pStyle w:val="BodyText"/>
         <w:numPr>
           <w:ilvl w:val="0"/>
-          <w:numId w:val="3"/>
+          <w:numId w:val="2"/>
         </w:numPr>
         <w:rPr/>
       </w:pPr>
@@ -543,7 +551,7 @@
         <w:pStyle w:val="BodyText"/>
         <w:numPr>
           <w:ilvl w:val="0"/>
-          <w:numId w:val="3"/>
+          <w:numId w:val="2"/>
         </w:numPr>
         <w:rPr/>
       </w:pPr>
@@ -557,7 +565,7 @@
         <w:pStyle w:val="BodyText"/>
         <w:numPr>
           <w:ilvl w:val="0"/>
-          <w:numId w:val="3"/>
+          <w:numId w:val="2"/>
         </w:numPr>
         <w:rPr/>
       </w:pPr>
@@ -571,7 +579,7 @@
         <w:pStyle w:val="BodyText"/>
         <w:numPr>
           <w:ilvl w:val="0"/>
-          <w:numId w:val="3"/>
+          <w:numId w:val="2"/>
         </w:numPr>
         <w:rPr/>
       </w:pPr>
@@ -585,7 +593,7 @@
         <w:pStyle w:val="BodyText"/>
         <w:numPr>
           <w:ilvl w:val="0"/>
-          <w:numId w:val="3"/>
+          <w:numId w:val="2"/>
         </w:numPr>
         <w:rPr/>
       </w:pPr>
@@ -19936,170 +19944,6 @@
   </w:abstractNum>
   <w:abstractNum w:abstractNumId="2">
     <w:lvl w:ilvl="0">
-      <w:start w:val="9"/>
-      <w:numFmt w:val="decimal"/>
-      <w:lvlText w:val="%1."/>
-      <w:lvlJc w:val="end"/>
-      <w:pPr>
-        <w:tabs>
-          <w:tab w:val="num" w:pos="0"/>
-        </w:tabs>
-        <w:ind w:start="720" w:hanging="360"/>
-      </w:pPr>
-      <w:rPr>
-        <w:dstrike w:val="false"/>
-        <w:strike w:val="false"/>
-        <w:u w:val="none"/>
-        <w:effect w:val="none"/>
-      </w:rPr>
-    </w:lvl>
-    <w:lvl w:ilvl="1">
-      <w:start w:val="1"/>
-      <w:numFmt w:val="decimal"/>
-      <w:lvlText w:val="%1.%2."/>
-      <w:lvlJc w:val="end"/>
-      <w:pPr>
-        <w:tabs>
-          <w:tab w:val="num" w:pos="0"/>
-        </w:tabs>
-        <w:ind w:start="1440" w:hanging="360"/>
-      </w:pPr>
-      <w:rPr>
-        <w:dstrike w:val="false"/>
-        <w:strike w:val="false"/>
-        <w:u w:val="none"/>
-        <w:effect w:val="none"/>
-      </w:rPr>
-    </w:lvl>
-    <w:lvl w:ilvl="2">
-      <w:start w:val="1"/>
-      <w:numFmt w:val="decimal"/>
-      <w:lvlText w:val="%1.%2.%3."/>
-      <w:lvlJc w:val="end"/>
-      <w:pPr>
-        <w:tabs>
-          <w:tab w:val="num" w:pos="0"/>
-        </w:tabs>
-        <w:ind w:start="2160" w:hanging="360"/>
-      </w:pPr>
-      <w:rPr>
-        <w:dstrike w:val="false"/>
-        <w:strike w:val="false"/>
-        <w:u w:val="none"/>
-        <w:effect w:val="none"/>
-      </w:rPr>
-    </w:lvl>
-    <w:lvl w:ilvl="3">
-      <w:start w:val="1"/>
-      <w:numFmt w:val="decimal"/>
-      <w:lvlText w:val="%1.%2.%3.%4."/>
-      <w:lvlJc w:val="end"/>
-      <w:pPr>
-        <w:tabs>
-          <w:tab w:val="num" w:pos="0"/>
-        </w:tabs>
-        <w:ind w:start="2880" w:hanging="360"/>
-      </w:pPr>
-      <w:rPr>
-        <w:dstrike w:val="false"/>
-        <w:strike w:val="false"/>
-        <w:u w:val="none"/>
-        <w:effect w:val="none"/>
-      </w:rPr>
-    </w:lvl>
-    <w:lvl w:ilvl="4">
-      <w:start w:val="1"/>
-      <w:numFmt w:val="decimal"/>
-      <w:lvlText w:val="%1.%2.%3.%4.%5."/>
-      <w:lvlJc w:val="end"/>
-      <w:pPr>
-        <w:tabs>
-          <w:tab w:val="num" w:pos="0"/>
-        </w:tabs>
-        <w:ind w:start="3600" w:hanging="360"/>
-      </w:pPr>
-      <w:rPr>
-        <w:dstrike w:val="false"/>
-        <w:strike w:val="false"/>
-        <w:u w:val="none"/>
-        <w:effect w:val="none"/>
-      </w:rPr>
-    </w:lvl>
-    <w:lvl w:ilvl="5">
-      <w:start w:val="1"/>
-      <w:numFmt w:val="decimal"/>
-      <w:lvlText w:val="%1.%2.%3.%4.%5.%6."/>
-      <w:lvlJc w:val="end"/>
-      <w:pPr>
-        <w:tabs>
-          <w:tab w:val="num" w:pos="0"/>
-        </w:tabs>
-        <w:ind w:start="4320" w:hanging="360"/>
-      </w:pPr>
-      <w:rPr>
-        <w:dstrike w:val="false"/>
-        <w:strike w:val="false"/>
-        <w:u w:val="none"/>
-        <w:effect w:val="none"/>
-      </w:rPr>
-    </w:lvl>
-    <w:lvl w:ilvl="6">
-      <w:start w:val="1"/>
-      <w:numFmt w:val="decimal"/>
-      <w:lvlText w:val="%1.%2.%3.%4.%5.%6.%7."/>
-      <w:lvlJc w:val="end"/>
-      <w:pPr>
-        <w:tabs>
-          <w:tab w:val="num" w:pos="0"/>
-        </w:tabs>
-        <w:ind w:start="5040" w:hanging="360"/>
-      </w:pPr>
-      <w:rPr>
-        <w:dstrike w:val="false"/>
-        <w:strike w:val="false"/>
-        <w:u w:val="none"/>
-        <w:effect w:val="none"/>
-      </w:rPr>
-    </w:lvl>
-    <w:lvl w:ilvl="7">
-      <w:start w:val="1"/>
-      <w:numFmt w:val="decimal"/>
-      <w:lvlText w:val="%1.%2.%3.%4.%5.%6.%7.%8."/>
-      <w:lvlJc w:val="end"/>
-      <w:pPr>
-        <w:tabs>
-          <w:tab w:val="num" w:pos="0"/>
-        </w:tabs>
-        <w:ind w:start="5760" w:hanging="360"/>
-      </w:pPr>
-      <w:rPr>
-        <w:dstrike w:val="false"/>
-        <w:strike w:val="false"/>
-        <w:u w:val="none"/>
-        <w:effect w:val="none"/>
-      </w:rPr>
-    </w:lvl>
-    <w:lvl w:ilvl="8">
-      <w:start w:val="1"/>
-      <w:numFmt w:val="decimal"/>
-      <w:lvlText w:val="%1.%2.%3.%4.%5.%6.%7.%8.%9."/>
-      <w:lvlJc w:val="end"/>
-      <w:pPr>
-        <w:tabs>
-          <w:tab w:val="num" w:pos="0"/>
-        </w:tabs>
-        <w:ind w:start="6480" w:hanging="360"/>
-      </w:pPr>
-      <w:rPr>
-        <w:dstrike w:val="false"/>
-        <w:strike w:val="false"/>
-        <w:u w:val="none"/>
-        <w:effect w:val="none"/>
-      </w:rPr>
-    </w:lvl>
-  </w:abstractNum>
-  <w:abstractNum w:abstractNumId="3">
-    <w:lvl w:ilvl="0">
       <w:start w:val="1"/>
       <w:numFmt w:val="bullet"/>
       <w:lvlText w:val=""/>
@@ -20235,7 +20079,7 @@
       </w:rPr>
     </w:lvl>
   </w:abstractNum>
-  <w:abstractNum w:abstractNumId="4">
+  <w:abstractNum w:abstractNumId="3">
     <w:lvl w:ilvl="0">
       <w:start w:val="1"/>
       <w:numFmt w:val="none"/>
@@ -20362,9 +20206,6 @@
   </w:num>
   <w:num w:numId="3">
     <w:abstractNumId w:val="3"/>
-  </w:num>
-  <w:num w:numId="4">
-    <w:abstractNumId w:val="4"/>
   </w:num>
 </w:numbering>
 </file>

</xml_diff>

<commit_message>
feat(report-creation): add total invested amount to national investments in publications
- add a <Question>_invested report variable, the sum of the stated amounts in
  millions of euros, and use {Question56_invested} in section 2.2.2
- count amounts such as 1.50 and .3 by using the shared isNumeric instead of the
  survey-tool one, which dropped them from totals, buckets and trends
- template: 32 responding countries (25 EU), note on automatic generation and
  paused questions, drop the List of Tables entry and citation [11], punctuation

Co-Authored-By: Claude Sonnet 5.5 <noreply@anthropic.com>
</commit_message>
<xml_diff>
--- a/src/assets/docx-templates/report_template.docx
+++ b/src/assets/docx-templates/report_template.docx
@@ -111,32 +111,6 @@
           <w:highlight w:val="cyan"/>
         </w:rPr>
         <w:t>Table of Contents</w:t>
-      </w:r>
-    </w:p>
-    <w:p>
-      <w:pPr>
-        <w:pStyle w:val="normal1"/>
-        <w:rPr/>
-      </w:pPr>
-      <w:r>
-        <w:rPr/>
-      </w:r>
-    </w:p>
-    <w:p>
-      <w:pPr>
-        <w:pStyle w:val="normal1"/>
-        <w:rPr>
-          <w:b/>
-          <w:bCs/>
-        </w:rPr>
-      </w:pPr>
-      <w:r>
-        <w:rPr>
-          <w:b/>
-          <w:bCs/>
-          <w:highlight w:val="cyan"/>
-        </w:rPr>
-        <w:t>List of Tables</w:t>
       </w:r>
     </w:p>
     <w:p>
@@ -648,7 +622,15 @@
       </w:r>
       <w:r>
         <w:rPr/>
-        <w:t xml:space="preserve">. The survey was developed by the EOSC Future project [1] and EOSC Steering Board (EOSC-SB) [2] to monitor policies, practices, and impacts related to EOSC and Open Science at national and institutional levels in Europe. The survey is targeted at the national members of EOSC-SB and runs annually, whereby a pilot survey was conducted in 2021 [3] and the first full survey was conducted in 2022 [4]. The results of each annual survey are archived in the EOSC Observatory Zenodo Community [5] and exploitable in the EOSC Open Science Observatory [6] which was first developed in EOSC Future and continued in the EOSC Track project [7]. </w:t>
+        <w:t xml:space="preserve">. The survey was developed by the EOSC Future project [1] and EOSC Steering Board (EOSC-SB) [2] to monitor policies, practices, and impacts related to EOSC and Open Science at national and institutional levels in Europe. The survey is targeted at the national members of EOSC-SB and runs annually, whereby a pilot survey was conducted in 2021 [3] and the first full survey was conducted in 2022 [4]. The results of each annual survey are archived in the EOSC Observatory Zenodo Community [5] and </w:t>
+      </w:r>
+      <w:r>
+        <w:rPr/>
+        <w:t xml:space="preserve">are </w:t>
+      </w:r>
+      <w:r>
+        <w:rPr/>
+        <w:t xml:space="preserve">exploitable in the EOSC Open Science Observatory [6], which was first developed in EOSC Future and continued in the EOSC Track project [7]. </w:t>
       </w:r>
     </w:p>
     <w:p>
@@ -677,7 +659,7 @@
       </w:r>
       <w:r>
         <w:rPr/>
-        <w:t xml:space="preserve"> is based on the revised version of the Monitoring Framework for National Contributions to EOSC [8] which consists of indicators for policies, practices, and impact across eight categories relevant for EOSC and Open Science including publications, data, software, services, infrastructure, skills/training, assessment, and engagement as shown in Table 1. This report provides an analysis of responses related to two policy indicators of countries with a national policy and financial strategy, two practice indicators of countries with a national monitoring and investments, and one impact indicator on yearly progress in policies and practices. Each analysis is supported by graphs which focus on positive responses, whereby negative responses group countries which either responded negatively to a question or did not respond to a question.</w:t>
+        <w:t xml:space="preserve"> is based on the revised version of the Monitoring Framework for National Contributions to EOSC [8], which consists of indicators for policies, practices, and impact across eight categories relevant for EOSC and Open Science, including publications, data, software, services, infrastructure, skills/training, assessment, and engagement as shown in Table 1. This report provides an analysis of responses related to two policy indicators of countries with a national policy and financial strategy, two practice indicators of countries with a national monitoring and investments, and one impact indicator on yearly progress in policies and practices. Each analysis is supported by graphs which focus on positive responses, whereby negative responses group countries which either responded negatively to a question or did not respond to a question.</w:t>
       </w:r>
     </w:p>
     <w:p>
@@ -705,8 +687,8 @@
         <w:tblLook w:noHBand="1" w:noVBand="1" w:firstColumn="0" w:lastRow="0" w:lastColumn="0" w:firstRow="0" w:val="0600"/>
       </w:tblPr>
       <w:tblGrid>
-        <w:gridCol w:w="1904"/>
-        <w:gridCol w:w="2578"/>
+        <w:gridCol w:w="1903"/>
+        <w:gridCol w:w="2579"/>
         <w:gridCol w:w="2577"/>
         <w:gridCol w:w="2570"/>
       </w:tblGrid>
@@ -716,7 +698,7 @@
         </w:trPr>
         <w:tc>
           <w:tcPr>
-            <w:tcW w:w="1904" w:type="dxa"/>
+            <w:tcW w:w="1903" w:type="dxa"/>
             <w:tcBorders/>
             <w:vAlign w:val="center"/>
           </w:tcPr>
@@ -744,7 +726,7 @@
         </w:tc>
         <w:tc>
           <w:tcPr>
-            <w:tcW w:w="2578" w:type="dxa"/>
+            <w:tcW w:w="2579" w:type="dxa"/>
             <w:tcBorders/>
             <w:shd w:color="auto" w:fill="31849B" w:val="clear"/>
             <w:vAlign w:val="bottom"/>
@@ -835,11 +817,11 @@
       </w:tr>
       <w:tr>
         <w:trPr>
-          <w:trHeight w:val="433" w:hRule="atLeast"/>
+          <w:trHeight w:val="432" w:hRule="atLeast"/>
         </w:trPr>
         <w:tc>
           <w:tcPr>
-            <w:tcW w:w="1904" w:type="dxa"/>
+            <w:tcW w:w="1903" w:type="dxa"/>
             <w:vMerge w:val="restart"/>
             <w:tcBorders/>
             <w:shd w:color="auto" w:fill="31849B" w:val="clear"/>
@@ -984,7 +966,15 @@
               <w:suppressAutoHyphens w:val="true"/>
               <w:spacing w:before="114" w:after="114"/>
               <w:jc w:val="both"/>
-              <w:rPr/>
+              <w:rPr>
+                <w:rFonts w:ascii="Open Sans" w:hAnsi="Open Sans" w:eastAsia="Open Sans" w:cs="Open Sans"/>
+                <w:b/>
+                <w:color w:val="FFFFFF"/>
+                <w:kern w:val="0"/>
+                <w:sz w:val="20"/>
+                <w:szCs w:val="20"/>
+                <w:lang w:val="nl-NL" w:eastAsia="zh-CN" w:bidi="hi-IN"/>
+              </w:rPr>
             </w:pPr>
             <w:r>
               <w:rPr>
@@ -999,10 +989,40 @@
               <w:t>Assessment</w:t>
             </w:r>
           </w:p>
+          <w:p>
+            <w:pPr>
+              <w:pStyle w:val="normal1"/>
+              <w:widowControl/>
+              <w:suppressAutoHyphens w:val="true"/>
+              <w:spacing w:before="114" w:after="114"/>
+              <w:jc w:val="both"/>
+              <w:rPr>
+                <w:rFonts w:ascii="Open Sans" w:hAnsi="Open Sans" w:eastAsia="Open Sans" w:cs="Open Sans"/>
+                <w:b/>
+                <w:color w:val="FFFFFF"/>
+                <w:kern w:val="0"/>
+                <w:sz w:val="20"/>
+                <w:szCs w:val="20"/>
+                <w:lang w:val="nl-NL" w:eastAsia="zh-CN" w:bidi="hi-IN"/>
+              </w:rPr>
+            </w:pPr>
+            <w:r>
+              <w:rPr>
+                <w:rFonts w:eastAsia="Open Sans" w:cs="Open Sans" w:ascii="Open Sans" w:hAnsi="Open Sans"/>
+                <w:b/>
+                <w:color w:val="FFFFFF"/>
+                <w:kern w:val="0"/>
+                <w:sz w:val="20"/>
+                <w:szCs w:val="20"/>
+                <w:lang w:val="nl-NL" w:eastAsia="zh-CN" w:bidi="hi-IN"/>
+              </w:rPr>
+              <w:t>Engagement</w:t>
+            </w:r>
+          </w:p>
         </w:tc>
         <w:tc>
           <w:tcPr>
-            <w:tcW w:w="2578" w:type="dxa"/>
+            <w:tcW w:w="2579" w:type="dxa"/>
             <w:vMerge w:val="restart"/>
             <w:tcBorders/>
             <w:shd w:color="auto" w:fill="B7DDE8" w:val="clear"/>
@@ -1090,11 +1110,11 @@
       </w:tr>
       <w:tr>
         <w:trPr>
-          <w:trHeight w:val="390" w:hRule="atLeast"/>
+          <w:trHeight w:val="352" w:hRule="atLeast"/>
         </w:trPr>
         <w:tc>
           <w:tcPr>
-            <w:tcW w:w="1904" w:type="dxa"/>
+            <w:tcW w:w="1903" w:type="dxa"/>
             <w:vMerge w:val="continue"/>
             <w:tcBorders/>
             <w:shd w:color="auto" w:fill="31849B" w:val="clear"/>
@@ -1128,7 +1148,7 @@
         </w:tc>
         <w:tc>
           <w:tcPr>
-            <w:tcW w:w="2578" w:type="dxa"/>
+            <w:tcW w:w="2579" w:type="dxa"/>
             <w:vMerge w:val="continue"/>
             <w:tcBorders/>
             <w:shd w:color="auto" w:fill="B7DDE8" w:val="clear"/>
@@ -1219,11 +1239,11 @@
       </w:tr>
       <w:tr>
         <w:trPr>
-          <w:trHeight w:val="390" w:hRule="atLeast"/>
+          <w:trHeight w:val="432" w:hRule="atLeast"/>
         </w:trPr>
         <w:tc>
           <w:tcPr>
-            <w:tcW w:w="1904" w:type="dxa"/>
+            <w:tcW w:w="1903" w:type="dxa"/>
             <w:vMerge w:val="continue"/>
             <w:tcBorders/>
             <w:shd w:color="auto" w:fill="31849B" w:val="clear"/>
@@ -1257,7 +1277,7 @@
         </w:tc>
         <w:tc>
           <w:tcPr>
-            <w:tcW w:w="2578" w:type="dxa"/>
+            <w:tcW w:w="2579" w:type="dxa"/>
             <w:vMerge w:val="restart"/>
             <w:tcBorders/>
             <w:shd w:color="auto" w:fill="B7DDE8" w:val="clear"/>
@@ -1345,11 +1365,11 @@
       </w:tr>
       <w:tr>
         <w:trPr>
-          <w:trHeight w:val="390" w:hRule="atLeast"/>
+          <w:trHeight w:val="597" w:hRule="atLeast"/>
         </w:trPr>
         <w:tc>
           <w:tcPr>
-            <w:tcW w:w="1904" w:type="dxa"/>
+            <w:tcW w:w="1903" w:type="dxa"/>
             <w:vMerge w:val="continue"/>
             <w:tcBorders/>
             <w:shd w:color="auto" w:fill="31849B" w:val="clear"/>
@@ -1383,7 +1403,7 @@
         </w:tc>
         <w:tc>
           <w:tcPr>
-            <w:tcW w:w="2578" w:type="dxa"/>
+            <w:tcW w:w="2579" w:type="dxa"/>
             <w:vMerge w:val="continue"/>
             <w:tcBorders/>
             <w:shd w:color="auto" w:fill="B7DDE8" w:val="clear"/>
@@ -1474,11 +1494,11 @@
       </w:tr>
       <w:tr>
         <w:trPr>
-          <w:trHeight w:val="390" w:hRule="atLeast"/>
+          <w:trHeight w:val="432" w:hRule="exact"/>
         </w:trPr>
         <w:tc>
           <w:tcPr>
-            <w:tcW w:w="1904" w:type="dxa"/>
+            <w:tcW w:w="1903" w:type="dxa"/>
             <w:vMerge w:val="continue"/>
             <w:tcBorders/>
             <w:shd w:color="auto" w:fill="31849B" w:val="clear"/>
@@ -1512,7 +1532,7 @@
         </w:tc>
         <w:tc>
           <w:tcPr>
-            <w:tcW w:w="2578" w:type="dxa"/>
+            <w:tcW w:w="2579" w:type="dxa"/>
             <w:vMerge w:val="restart"/>
             <w:tcBorders/>
             <w:shd w:color="auto" w:fill="B7DDE8" w:val="clear"/>
@@ -1600,11 +1620,11 @@
       </w:tr>
       <w:tr>
         <w:trPr>
-          <w:trHeight w:val="390" w:hRule="atLeast"/>
+          <w:trHeight w:val="514" w:hRule="atLeast"/>
         </w:trPr>
         <w:tc>
           <w:tcPr>
-            <w:tcW w:w="1904" w:type="dxa"/>
+            <w:tcW w:w="1903" w:type="dxa"/>
             <w:vMerge w:val="continue"/>
             <w:tcBorders/>
             <w:shd w:color="auto" w:fill="31849B" w:val="clear"/>
@@ -1638,7 +1658,7 @@
         </w:tc>
         <w:tc>
           <w:tcPr>
-            <w:tcW w:w="2578" w:type="dxa"/>
+            <w:tcW w:w="2579" w:type="dxa"/>
             <w:vMerge w:val="continue"/>
             <w:tcBorders/>
             <w:shd w:color="auto" w:fill="B7DDE8" w:val="clear"/>
@@ -1729,11 +1749,11 @@
       </w:tr>
       <w:tr>
         <w:trPr>
-          <w:trHeight w:val="390" w:hRule="atLeast"/>
+          <w:trHeight w:val="432" w:hRule="exact"/>
         </w:trPr>
         <w:tc>
           <w:tcPr>
-            <w:tcW w:w="1904" w:type="dxa"/>
+            <w:tcW w:w="1903" w:type="dxa"/>
             <w:vMerge w:val="continue"/>
             <w:tcBorders/>
             <w:shd w:color="auto" w:fill="31849B" w:val="clear"/>
@@ -1767,7 +1787,7 @@
         </w:tc>
         <w:tc>
           <w:tcPr>
-            <w:tcW w:w="2578" w:type="dxa"/>
+            <w:tcW w:w="2579" w:type="dxa"/>
             <w:vMerge w:val="restart"/>
             <w:tcBorders/>
             <w:shd w:color="auto" w:fill="B7DDE8" w:val="clear"/>
@@ -1859,7 +1879,7 @@
         </w:trPr>
         <w:tc>
           <w:tcPr>
-            <w:tcW w:w="1904" w:type="dxa"/>
+            <w:tcW w:w="1903" w:type="dxa"/>
             <w:vMerge w:val="continue"/>
             <w:tcBorders/>
             <w:shd w:color="auto" w:fill="31849B" w:val="clear"/>
@@ -1889,7 +1909,7 @@
         </w:tc>
         <w:tc>
           <w:tcPr>
-            <w:tcW w:w="2578" w:type="dxa"/>
+            <w:tcW w:w="2579" w:type="dxa"/>
             <w:vMerge w:val="continue"/>
             <w:tcBorders/>
             <w:shd w:color="auto" w:fill="B7DDE8" w:val="clear"/>
@@ -2041,7 +2061,23 @@
       </w:r>
       <w:r>
         <w:rPr/>
-        <w:t xml:space="preserve"> was published in the EOSC Open Science Observatory on 21 February 2025 and ran until 29 August 2025, whereby 31 countries responded consisting of 24 of the 27 European Union (EU) countries and 7 non-EU countries as shown in Tables 2 and 3. This report is based on the data collected from Survey {</w:t>
+        <w:t xml:space="preserve"> was published in the EOSC Open Science Observatory on 21 February 2025 and ran until 29 August 2025, whereby 3</w:t>
+      </w:r>
+      <w:r>
+        <w:rPr/>
+        <w:t>2</w:t>
+      </w:r>
+      <w:r>
+        <w:rPr/>
+        <w:t xml:space="preserve"> countries responded, consisting of 2</w:t>
+      </w:r>
+      <w:r>
+        <w:rPr/>
+        <w:t>5</w:t>
+      </w:r>
+      <w:r>
+        <w:rPr/>
+        <w:t xml:space="preserve"> of the 27 European Union (EU) countries and 7 non-EU countries as shown in Tables 2 and 3. This report is based on  data collected from Survey {</w:t>
       </w:r>
       <w:r>
         <w:rPr>
@@ -2061,7 +2097,7 @@
       </w:r>
       <w:r>
         <w:rPr/>
-        <w:t xml:space="preserve"> and focuses exclusively on the survey results for the 24 responding EU countries. It should be noted that only one response is accepted from Belgium, whereby an answer is marked positive if there is a policy, financial strategy, or national monitoring in at least one region or community or at the federal level, and whereby investments are calculated at the federal level. It should also be noted that all responses and investments from Germany are at the federal level.</w:t>
+        <w:t xml:space="preserve"> and focuses on the survey results for the 24 responding EU countries. It should be noted that only one response is accepted from Belgium, whereby an answer is marked positive if there is a policy, financial strategy, or national monitoring in at least one region or community or at the federal level, and whereby investments are calculated at the federal level. It should also be noted that all responses and investments from Germany are at the federal level.</w:t>
       </w:r>
     </w:p>
     <w:p>
@@ -2188,12 +2224,114 @@
     </w:p>
     <w:p>
       <w:pPr>
-        <w:pStyle w:val="normal1"/>
-        <w:rPr/>
-      </w:pPr>
-      <w:r>
-        <w:rPr/>
-        <w:t>The report is structured around the eight categories relevant for EOSC and Open Science and presents survey results for publications (Section 2), data (Section 3), software (Section 4), services (Section 5), infrastructure (Section 6), skills/training (Section 7), assessment (Section 8), and engagement (Section 9) as well as for total investments in EOSC and Open Science (Section 10).</w:t>
+        <w:pStyle w:val="Normal"/>
+        <w:ind w:hanging="0" w:left="0" w:right="0"/>
+        <w:rPr>
+          <w:rFonts w:ascii="Arial;sans-serif" w:hAnsi="Arial;sans-serif"/>
+          <w:b w:val="false"/>
+          <w:i w:val="false"/>
+          <w:caps w:val="false"/>
+          <w:smallCaps w:val="false"/>
+          <w:strike w:val="false"/>
+          <w:dstrike w:val="false"/>
+          <w:color w:val="000000"/>
+          <w:sz w:val="22"/>
+          <w:u w:val="none"/>
+          <w:effect w:val="none"/>
+          <w:shd w:fill="auto" w:val="clear"/>
+        </w:rPr>
+      </w:pPr>
+      <w:bookmarkStart w:id="1" w:name="docs-internal-guid-f908ad3e-7fff-cc7c-f4"/>
+      <w:bookmarkEnd w:id="1"/>
+      <w:r>
+        <w:rPr>
+          <w:rFonts w:ascii="Arial;sans-serif" w:hAnsi="Arial;sans-serif"/>
+          <w:b w:val="false"/>
+          <w:i w:val="false"/>
+          <w:caps w:val="false"/>
+          <w:smallCaps w:val="false"/>
+          <w:strike w:val="false"/>
+          <w:dstrike w:val="false"/>
+          <w:color w:val="000000"/>
+          <w:sz w:val="22"/>
+          <w:u w:val="none"/>
+          <w:effect w:val="none"/>
+          <w:shd w:fill="auto" w:val="clear"/>
+        </w:rPr>
+        <w:t xml:space="preserve">This report has been automatically generated based on a scripted template integrating the survey data and has been checked and revised by the authors. It should be noted that questions on Offering Services through EOSC and Connecting Repositories to EOSC in the survey have been paused due to the launch of the EOSC Federation and evaluation of what these questions mean. </w:t>
+      </w:r>
+    </w:p>
+    <w:p>
+      <w:pPr>
+        <w:pStyle w:val="normal1"/>
+        <w:rPr/>
+      </w:pPr>
+      <w:r>
+        <w:rPr/>
+        <w:t xml:space="preserve">The report is structured around the categories relevant for EOSC and Open Science </w:t>
+      </w:r>
+      <w:bookmarkStart w:id="2" w:name="docs-internal-guid-4c99f215-7fff-49e5-58"/>
+      <w:bookmarkEnd w:id="2"/>
+      <w:r>
+        <w:rPr>
+          <w:rFonts w:ascii="Arial;sans-serif" w:hAnsi="Arial;sans-serif"/>
+          <w:b w:val="false"/>
+          <w:i w:val="false"/>
+          <w:caps w:val="false"/>
+          <w:smallCaps w:val="false"/>
+          <w:strike w:val="false"/>
+          <w:dstrike w:val="false"/>
+          <w:color w:val="000000"/>
+          <w:sz w:val="22"/>
+          <w:u w:val="none"/>
+          <w:effect w:val="none"/>
+          <w:shd w:fill="auto" w:val="clear"/>
+        </w:rPr>
+        <w:t xml:space="preserve">excluding Services) </w:t>
+      </w:r>
+      <w:r>
+        <w:rPr/>
+        <w:t xml:space="preserve">and presents survey results for publications (Section 2), data (Section 3), software (Section 4), infrastructure (Section </w:t>
+      </w:r>
+      <w:r>
+        <w:rPr/>
+        <w:t>5</w:t>
+      </w:r>
+      <w:r>
+        <w:rPr/>
+        <w:t xml:space="preserve">), skills/training (Section </w:t>
+      </w:r>
+      <w:r>
+        <w:rPr/>
+        <w:t>6</w:t>
+      </w:r>
+      <w:r>
+        <w:rPr/>
+        <w:t xml:space="preserve">), assessment (Section </w:t>
+      </w:r>
+      <w:r>
+        <w:rPr/>
+        <w:t>7</w:t>
+      </w:r>
+      <w:r>
+        <w:rPr/>
+        <w:t xml:space="preserve">), and engagement (Section </w:t>
+      </w:r>
+      <w:r>
+        <w:rPr/>
+        <w:t>8</w:t>
+      </w:r>
+      <w:r>
+        <w:rPr/>
+        <w:t xml:space="preserve">) as well as total investments in EOSC and Open Science (Section </w:t>
+      </w:r>
+      <w:r>
+        <w:rPr/>
+        <w:t>9</w:t>
+      </w:r>
+      <w:r>
+        <w:rPr/>
+        <w:t>).</w:t>
       </w:r>
     </w:p>
     <w:p>
@@ -3552,6 +3690,20 @@
         <w:rPr/>
         <w:t>} &gt;1000 €K per 1000 FTE researchers as shown in Figure 13.</w:t>
       </w:r>
+      <w:r>
+        <w:rPr/>
+        <w:t xml:space="preserve"> The total amount invested by responding EU countries in open access to publications was €</w:t>
+      </w:r>
+      <w:r>
+        <w:rPr>
+          <w:highlight w:val="yellow"/>
+        </w:rPr>
+        <w:t>{Question56_invested}</w:t>
+      </w:r>
+      <w:r>
+        <w:rPr/>
+        <w:t xml:space="preserve"> million.</w:t>
+      </w:r>
     </w:p>
     <w:p>
       <w:pPr>
@@ -3602,14 +3754,14 @@
         </w:rPr>
         <w:t xml:space="preserve">Figure 13: </w:t>
       </w:r>
-      <w:bookmarkStart w:id="1" w:name="__DdeLink__2403_2503287465"/>
+      <w:bookmarkStart w:id="3" w:name="__DdeLink__2403_2503287465"/>
       <w:r>
         <w:rPr>
           <w:i/>
         </w:rPr>
         <w:t>Number of EU Countries with National Investments in Open Access to Publications per 1000 FTE Researchers</w:t>
       </w:r>
-      <w:bookmarkEnd w:id="1"/>
+      <w:bookmarkEnd w:id="3"/>
     </w:p>
     <w:p>
       <w:pPr>
@@ -4672,7 +4824,7 @@
       </w:pPr>
       <w:r>
         <w:rPr/>
-        <w:t>The data category consists of three main topics: data management, FAIR data [11], and open data.</w:t>
+        <w:t>The data category consists of three main topics: data management, FAIR data, and open data.</w:t>
       </w:r>
     </w:p>
     <w:p>
@@ -4768,7 +4920,7 @@
         </w:rPr>
         <w:t xml:space="preserve">Does your country have a </w:t>
       </w:r>
-      <w:bookmarkStart w:id="2" w:name="__DdeLink__4078_473164209"/>
+      <w:bookmarkStart w:id="4" w:name="__DdeLink__4078_473164209"/>
       <w:r>
         <w:rPr>
           <w:i/>
@@ -4776,7 +4928,7 @@
         </w:rPr>
         <w:t>national policy on data management</w:t>
       </w:r>
-      <w:bookmarkEnd w:id="2"/>
+      <w:bookmarkEnd w:id="4"/>
       <w:r>
         <w:rPr>
           <w:i/>
@@ -4961,7 +5113,7 @@
         <w:rPr/>
         <w:t xml:space="preserve">The first main policy question on FAIR data in Survey </w:t>
       </w:r>
-      <w:bookmarkStart w:id="3" w:name="_Hlk213851171"/>
+      <w:bookmarkStart w:id="5" w:name="_Hlk213851171"/>
       <w:r>
         <w:rPr/>
         <w:t>{</w:t>
@@ -4976,7 +5128,7 @@
         <w:rPr/>
         <w:t xml:space="preserve"> </w:t>
       </w:r>
-      <w:bookmarkEnd w:id="3"/>
+      <w:bookmarkEnd w:id="5"/>
       <w:r>
         <w:rPr/>
         <w:t xml:space="preserve">is </w:t>
@@ -19966,8 +20118,8 @@
     <w:name w:val="line number"/>
     <w:rPr/>
   </w:style>
-  <w:style w:type="character" w:styleId="Bulletsuser">
-    <w:name w:val="Bullets (user)"/>
+  <w:style w:type="character" w:styleId="Bullets">
+    <w:name w:val="Bullets"/>
     <w:qFormat/>
     <w:rPr>
       <w:rFonts w:ascii="OpenSymbol" w:hAnsi="OpenSymbol" w:eastAsia="OpenSymbol" w:cs="OpenSymbol"/>

</xml_diff>